<commit_message>
Minor edits - testing repo access
Minor edits - I am testing my ability to edit existing files.  This file needs to be reviewed because at the June meeting, some reburbishers said instructions for the Powershell scripts were not accurate, or the PowerShell scripts themselves were not working.
</commit_message>
<xml_diff>
--- a/kindworks_powershell_instructions_Jan_2026.docx
+++ b/kindworks_powershell_instructions_Jan_2026.docx
@@ -78,7 +78,32 @@
           <w:sz w:val="36"/>
           <w:szCs w:val="36"/>
         </w:rPr>
+        <w:t xml:space="preserve">Originally Written </w:t>
+      </w:r>
+      <w:r>
+        <w:rPr>
+          <w:sz w:val="36"/>
+          <w:szCs w:val="36"/>
+        </w:rPr>
         <w:t>December 2025 by Adam and Brayden</w:t>
+      </w:r>
+    </w:p>
+    <w:p>
+      <w:pPr>
+        <w:pStyle w:val="BodyText"/>
+        <w:ind w:hanging="0" w:left="0"/>
+        <w:jc w:val="center"/>
+        <w:rPr>
+          <w:sz w:val="36"/>
+          <w:szCs w:val="36"/>
+        </w:rPr>
+      </w:pPr>
+      <w:r>
+        <w:rPr>
+          <w:sz w:val="36"/>
+          <w:szCs w:val="36"/>
+        </w:rPr>
+        <w:t>Updated June 2026</w:t>
       </w:r>
     </w:p>
     <w:p>
@@ -155,10 +180,16 @@
         <w:pStyle w:val="Normal"/>
         <w:bidi w:val="0"/>
         <w:jc w:val="left"/>
-        <w:rPr/>
-      </w:pPr>
-      <w:r>
-        <w:rPr/>
+        <w:rPr>
+          <w:b/>
+          <w:bCs/>
+        </w:rPr>
+      </w:pPr>
+      <w:r>
+        <w:rPr>
+          <w:b/>
+          <w:bCs/>
+        </w:rPr>
         <w:t>This document assumes that the user has downloaded all of the below listed scripts onto an external drive of some sort.</w:t>
       </w:r>
     </w:p>
@@ -1966,7 +1997,7 @@
       <w:r>
         <w:rPr/>
         <w:drawing>
-          <wp:anchor behindDoc="0" distT="0" distB="0" distL="0" distR="0" simplePos="0" locked="0" layoutInCell="0" allowOverlap="1" relativeHeight="2">
+          <wp:anchor distT="0" distB="0" distL="0" distR="0" simplePos="0" relativeHeight="2" behindDoc="0" locked="0" layoutInCell="0" allowOverlap="1">
             <wp:simplePos x="0" y="0"/>
             <wp:positionH relativeFrom="column">
               <wp:align>center</wp:align>
@@ -4287,8 +4318,8 @@
     <w:qFormat/>
     <w:rPr/>
   </w:style>
-  <w:style w:type="character" w:styleId="Bullets">
-    <w:name w:val="Bullets"/>
+  <w:style w:type="character" w:styleId="Bulletsuser">
+    <w:name w:val="Bullets (user)"/>
     <w:qFormat/>
     <w:rPr>
       <w:rFonts w:ascii="OpenSymbol" w:hAnsi="OpenSymbol" w:eastAsia="OpenSymbol" w:cs="OpenSymbol"/>
@@ -4308,8 +4339,8 @@
       <w:u w:val="single"/>
     </w:rPr>
   </w:style>
-  <w:style w:type="character" w:styleId="Bulletsuser">
-    <w:name w:val="Bullets (user)"/>
+  <w:style w:type="character" w:styleId="Bullets">
+    <w:name w:val="Bullets"/>
     <w:qFormat/>
     <w:rPr>
       <w:rFonts w:ascii="OpenSymbol" w:hAnsi="OpenSymbol" w:eastAsia="OpenSymbol" w:cs="OpenSymbol"/>
@@ -4399,37 +4430,37 @@
         <a:srgbClr val="000000"/>
       </a:dk1>
       <a:lt1>
-        <a:srgbClr val="ffffff"/>
+        <a:srgbClr val="FFFFFF"/>
       </a:lt1>
       <a:dk2>
         <a:srgbClr val="000000"/>
       </a:dk2>
       <a:lt2>
-        <a:srgbClr val="ffffff"/>
+        <a:srgbClr val="FFFFFF"/>
       </a:lt2>
       <a:accent1>
-        <a:srgbClr val="18a303"/>
+        <a:srgbClr val="18A303"/>
       </a:accent1>
       <a:accent2>
-        <a:srgbClr val="0369a3"/>
+        <a:srgbClr val="0369A3"/>
       </a:accent2>
       <a:accent3>
-        <a:srgbClr val="a33e03"/>
+        <a:srgbClr val="A33E03"/>
       </a:accent3>
       <a:accent4>
-        <a:srgbClr val="8e03a3"/>
+        <a:srgbClr val="8E03A3"/>
       </a:accent4>
       <a:accent5>
-        <a:srgbClr val="c99c00"/>
+        <a:srgbClr val="C99C00"/>
       </a:accent5>
       <a:accent6>
-        <a:srgbClr val="c9211e"/>
+        <a:srgbClr val="C9211E"/>
       </a:accent6>
       <a:hlink>
-        <a:srgbClr val="0000ee"/>
+        <a:srgbClr val="0000EE"/>
       </a:hlink>
       <a:folHlink>
-        <a:srgbClr val="551a8b"/>
+        <a:srgbClr val="551A8B"/>
       </a:folHlink>
     </a:clrScheme>
     <a:fontScheme name="Office">

</xml_diff>